<commit_message>
Small Baseline 3 updates, added bug report template
</commit_message>
<xml_diff>
--- a/documentation/Meeting Logs/Baseline Sprint 3.docx
+++ b/documentation/Meeting Logs/Baseline Sprint 3.docx
@@ -99,7 +99,29 @@
           <w:szCs w:val="32"/>
           <w14:ligatures w14:val="none"/>
         </w:rPr>
-        <w:t xml:space="preserve"> February 16 – March 22, 2026</w:t>
+        <w:t xml:space="preserve"> March 2</w:t>
+      </w:r>
+      <w:r>
+        <w:rPr>
+          <w:rFonts w:ascii="Times New Roman" w:eastAsia="Times New Roman" w:hAnsi="Times New Roman" w:cs="Times New Roman"/>
+          <w:color w:val="000000"/>
+          <w:kern w:val="0"/>
+          <w:sz w:val="32"/>
+          <w:szCs w:val="32"/>
+          <w14:ligatures w14:val="none"/>
+        </w:rPr>
+        <w:t>3 – April 12</w:t>
+      </w:r>
+      <w:r>
+        <w:rPr>
+          <w:rFonts w:ascii="Times New Roman" w:eastAsia="Times New Roman" w:hAnsi="Times New Roman" w:cs="Times New Roman"/>
+          <w:color w:val="000000"/>
+          <w:kern w:val="0"/>
+          <w:sz w:val="32"/>
+          <w:szCs w:val="32"/>
+          <w14:ligatures w14:val="none"/>
+        </w:rPr>
+        <w:t>, 2026</w:t>
       </w:r>
     </w:p>
     <w:p>
@@ -309,7 +331,29 @@
           <w:szCs w:val="32"/>
           <w14:ligatures w14:val="none"/>
         </w:rPr>
-        <w:t>: March 22, 2026</w:t>
+        <w:t xml:space="preserve">: </w:t>
+      </w:r>
+      <w:r>
+        <w:rPr>
+          <w:rFonts w:ascii="Times New Roman" w:eastAsia="Times New Roman" w:hAnsi="Times New Roman" w:cs="Times New Roman"/>
+          <w:color w:val="000000"/>
+          <w:kern w:val="0"/>
+          <w:sz w:val="32"/>
+          <w:szCs w:val="32"/>
+          <w14:ligatures w14:val="none"/>
+        </w:rPr>
+        <w:t>April 12</w:t>
+      </w:r>
+      <w:r>
+        <w:rPr>
+          <w:rFonts w:ascii="Times New Roman" w:eastAsia="Times New Roman" w:hAnsi="Times New Roman" w:cs="Times New Roman"/>
+          <w:color w:val="000000"/>
+          <w:kern w:val="0"/>
+          <w:sz w:val="32"/>
+          <w:szCs w:val="32"/>
+          <w14:ligatures w14:val="none"/>
+        </w:rPr>
+        <w:t>, 2026</w:t>
       </w:r>
     </w:p>
     <w:p/>
@@ -1680,13 +1724,7 @@
       </w:r>
       <w:r>
         <w:noBreakHyphen/>
-        <w:t>1:</w:t>
-      </w:r>
-      <w:r>
-        <w:t xml:space="preserve"> </w:t>
-      </w:r>
-      <w:r>
-        <w:t>The system shall present a user interface that enables task completion without requiring external documentation.</w:t>
+        <w:t>1: The system shall present a user interface that enables task completion without requiring external documentation.</w:t>
       </w:r>
     </w:p>
     <w:p>
@@ -1702,13 +1740,7 @@
       </w:r>
       <w:r>
         <w:noBreakHyphen/>
-        <w:t>2:</w:t>
-      </w:r>
-      <w:r>
-        <w:t xml:space="preserve"> </w:t>
-      </w:r>
-      <w:r>
-        <w:t>Users shall be able to access all core features within three user interactions.</w:t>
+        <w:t>2: Users shall be able to access all core features within three user interactions.</w:t>
       </w:r>
     </w:p>
     <w:p>
@@ -1724,13 +1756,7 @@
       </w:r>
       <w:r>
         <w:noBreakHyphen/>
-        <w:t>3:</w:t>
-      </w:r>
-      <w:r>
-        <w:t xml:space="preserve"> </w:t>
-      </w:r>
-      <w:r>
-        <w:t>The system shall support responsive design for both desktop and mobile devices.</w:t>
+        <w:t>3: The system shall support responsive design for both desktop and mobile devices.</w:t>
       </w:r>
     </w:p>
     <w:p>
@@ -1746,13 +1772,7 @@
       </w:r>
       <w:r>
         <w:noBreakHyphen/>
-        <w:t>4:</w:t>
-      </w:r>
-      <w:r>
-        <w:t xml:space="preserve"> </w:t>
-      </w:r>
-      <w:r>
-        <w:t>The system shall display clear visual indicators representing fuel stations on the map.</w:t>
+        <w:t>4: The system shall display clear visual indicators representing fuel stations on the map.</w:t>
       </w:r>
     </w:p>
     <w:p>
@@ -1768,13 +1788,7 @@
       </w:r>
       <w:r>
         <w:noBreakHyphen/>
-        <w:t>5:</w:t>
-      </w:r>
-      <w:r>
-        <w:t xml:space="preserve"> </w:t>
-      </w:r>
-      <w:r>
-        <w:t>The system shall display loading indicators while data is being retrieved.</w:t>
+        <w:t>5: The system shall display loading indicators while data is being retrieved.</w:t>
       </w:r>
     </w:p>
     <w:p>
@@ -1790,13 +1804,7 @@
       </w:r>
       <w:r>
         <w:noBreakHyphen/>
-        <w:t>6:</w:t>
-      </w:r>
-      <w:r>
-        <w:t xml:space="preserve"> </w:t>
-      </w:r>
-      <w:r>
-        <w:t>The system shall display error messages using clear, user</w:t>
+        <w:t>6: The system shall display error messages using clear, user</w:t>
       </w:r>
       <w:r>
         <w:noBreakHyphen/>
@@ -1828,13 +1836,7 @@
       </w:r>
       <w:r>
         <w:noBreakHyphen/>
-        <w:t>1:</w:t>
-      </w:r>
-      <w:r>
-        <w:t xml:space="preserve"> </w:t>
-      </w:r>
-      <w:r>
-        <w:t>The system shall support geographic expansion to new regions without requiring major architectural changes.</w:t>
+        <w:t>1: The system shall support geographic expansion to new regions without requiring major architectural changes.</w:t>
       </w:r>
     </w:p>
     <w:p>
@@ -1850,13 +1852,7 @@
       </w:r>
       <w:r>
         <w:noBreakHyphen/>
-        <w:t>2:</w:t>
-      </w:r>
-      <w:r>
-        <w:t xml:space="preserve"> </w:t>
-      </w:r>
-      <w:r>
-        <w:t>The backend shall support horizontal scaling to accommodate increased demand.</w:t>
+        <w:t>2: The backend shall support horizontal scaling to accommodate increased demand.</w:t>
       </w:r>
     </w:p>
     <w:p>
@@ -1872,13 +1868,7 @@
       </w:r>
       <w:r>
         <w:noBreakHyphen/>
-        <w:t>3:</w:t>
-      </w:r>
-      <w:r>
-        <w:t xml:space="preserve"> </w:t>
-      </w:r>
-      <w:r>
-        <w:t>The database shall efficiently handle datasets containing one million records or more.</w:t>
+        <w:t>3: The database shall efficiently handle datasets containing one million records or more.</w:t>
       </w:r>
     </w:p>
     <w:p>
@@ -1895,13 +1885,7 @@
       </w:r>
       <w:r>
         <w:noBreakHyphen/>
-        <w:t>4:</w:t>
-      </w:r>
-      <w:r>
-        <w:t xml:space="preserve"> </w:t>
-      </w:r>
-      <w:r>
-        <w:t>Sensitive configuration values shall not be hardcoded and shall be stored securely.</w:t>
+        <w:t>4: Sensitive configuration values shall not be hardcoded and shall be stored securely.</w:t>
       </w:r>
     </w:p>
     <w:p>
@@ -2241,13 +2225,7 @@
       </w:r>
       <w:r>
         <w:noBreakHyphen/>
-        <w:t>1:</w:t>
-      </w:r>
-      <w:r>
-        <w:t xml:space="preserve"> </w:t>
-      </w:r>
-      <w:r>
-        <w:t>The system shall validate all external API data before storing it locally.</w:t>
+        <w:t>1: The system shall validate all external API data before storing it locally.</w:t>
       </w:r>
     </w:p>
     <w:p>
@@ -2264,13 +2242,7 @@
       </w:r>
       <w:r>
         <w:noBreakHyphen/>
-        <w:t>2:</w:t>
-      </w:r>
-      <w:r>
-        <w:t xml:space="preserve"> </w:t>
-      </w:r>
-      <w:r>
-        <w:t>All stored data shall include timestamps indicating when the data was retrieved.</w:t>
+        <w:t>2: All stored data shall include timestamps indicating when the data was retrieved.</w:t>
       </w:r>
     </w:p>
     <w:p>
@@ -2286,13 +2258,7 @@
       </w:r>
       <w:r>
         <w:noBreakHyphen/>
-        <w:t>3:</w:t>
-      </w:r>
-      <w:r>
-        <w:t xml:space="preserve"> </w:t>
-      </w:r>
-      <w:r>
-        <w:t>The system shall prevent duplicate records from being stored.</w:t>
+        <w:t>3: The system shall prevent duplicate records from being stored.</w:t>
       </w:r>
     </w:p>
     <w:p>
@@ -2308,13 +2274,7 @@
       </w:r>
       <w:r>
         <w:noBreakHyphen/>
-        <w:t>4:</w:t>
-      </w:r>
-      <w:r>
-        <w:t xml:space="preserve"> </w:t>
-      </w:r>
-      <w:r>
-        <w:t>Cached data shall be refreshed at least once every 24 hours.</w:t>
+        <w:t>4: Cached data shall be refreshed at least once every 24 hours.</w:t>
       </w:r>
     </w:p>
     <w:p>
@@ -2330,13 +2290,7 @@
       </w:r>
       <w:r>
         <w:noBreakHyphen/>
-        <w:t>5:</w:t>
-      </w:r>
-      <w:r>
-        <w:t xml:space="preserve"> </w:t>
-      </w:r>
-      <w:r>
-        <w:t>The system shall clearly indicate when displayed data may be outdated.</w:t>
+        <w:t>5: The system shall clearly indicate when displayed data may be outdated.</w:t>
       </w:r>
     </w:p>
     <w:p>
@@ -2715,7 +2669,7 @@
       <w:r>
         <w:lastRenderedPageBreak/>
         <w:pict w14:anchorId="27FB2B18">
-          <v:rect id="_x0000_i1042" style="width:0;height:1.5pt" o:hralign="center" o:hrstd="t" o:hr="t" fillcolor="#a0a0a0" stroked="f"/>
+          <v:rect id="_x0000_i1039" style="width:0;height:1.5pt" o:hralign="center" o:hrstd="t" o:hr="t" fillcolor="#a0a0a0" stroked="f"/>
         </w:pict>
       </w:r>
     </w:p>
@@ -3569,7 +3523,13 @@
         </w:numPr>
       </w:pPr>
       <w:r>
-        <w:t>MapsService calls the Google Places API, returns nearby gas and EVstations, and asynchronously upserts station/location/brand cache data intoPrisma.</w:t>
+        <w:t xml:space="preserve">MapsService calls the Google Places API, returns nearby gas and EVstations, and asynchronously </w:t>
+      </w:r>
+      <w:r>
+        <w:t>in</w:t>
+      </w:r>
+      <w:r>
+        <w:t>serts station/location/brand cache data intoPrisma.</w:t>
       </w:r>
     </w:p>
     <w:p>
@@ -3593,7 +3553,13 @@
         </w:numPr>
       </w:pPr>
       <w:r>
-        <w:t>Prisma entities exist for users, user config, fuel types, fuel prices, stations,locations, and brands.</w:t>
+        <w:t>Prisma entities exist for users, user config, fuel types, fuel prices, stations,</w:t>
+      </w:r>
+      <w:r>
+        <w:t xml:space="preserve"> </w:t>
+      </w:r>
+      <w:r>
+        <w:t>locations, and brands.</w:t>
       </w:r>
     </w:p>
     <w:p>
@@ -6195,6 +6161,7 @@
           <w:kern w:val="0"/>
           <w:sz w:val="27"/>
           <w:szCs w:val="27"/>
+          <w:lang w:val="fr-FR"/>
           <w14:ligatures w14:val="none"/>
         </w:rPr>
       </w:pPr>
@@ -6225,6 +6192,7 @@
           <w:kern w:val="0"/>
           <w:sz w:val="27"/>
           <w:szCs w:val="27"/>
+          <w:lang w:val="fr-FR"/>
           <w14:ligatures w14:val="none"/>
         </w:rPr>
       </w:pPr>
@@ -6275,6 +6243,7 @@
           <w:kern w:val="0"/>
           <w:sz w:val="27"/>
           <w:szCs w:val="27"/>
+          <w:lang w:val="fr-FR"/>
           <w14:ligatures w14:val="none"/>
         </w:rPr>
       </w:pPr>
@@ -6325,6 +6294,7 @@
           <w:kern w:val="0"/>
           <w:sz w:val="27"/>
           <w:szCs w:val="27"/>
+          <w:lang w:val="fr-FR"/>
           <w14:ligatures w14:val="none"/>
         </w:rPr>
       </w:pPr>
@@ -6385,6 +6355,7 @@
           <w:kern w:val="0"/>
           <w:sz w:val="27"/>
           <w:szCs w:val="27"/>
+          <w:lang w:val="fr-FR"/>
           <w14:ligatures w14:val="none"/>
         </w:rPr>
       </w:pPr>
@@ -6445,6 +6416,7 @@
           <w:kern w:val="0"/>
           <w:sz w:val="27"/>
           <w:szCs w:val="27"/>
+          <w:lang w:val="fr-FR"/>
           <w14:ligatures w14:val="none"/>
         </w:rPr>
       </w:pPr>
@@ -6475,6 +6447,7 @@
           <w:kern w:val="0"/>
           <w:sz w:val="27"/>
           <w:szCs w:val="27"/>
+          <w:lang w:val="fr-FR"/>
           <w14:ligatures w14:val="none"/>
         </w:rPr>
       </w:pPr>
@@ -6535,6 +6508,7 @@
           <w:kern w:val="0"/>
           <w:sz w:val="27"/>
           <w:szCs w:val="27"/>
+          <w:lang w:val="fr-FR"/>
           <w14:ligatures w14:val="none"/>
         </w:rPr>
       </w:pPr>
@@ -6595,6 +6569,7 @@
           <w:kern w:val="0"/>
           <w:sz w:val="27"/>
           <w:szCs w:val="27"/>
+          <w:lang w:val="fr-FR"/>
           <w14:ligatures w14:val="none"/>
         </w:rPr>
       </w:pPr>
@@ -6655,6 +6630,7 @@
           <w:kern w:val="0"/>
           <w:sz w:val="27"/>
           <w:szCs w:val="27"/>
+          <w:lang w:val="fr-FR"/>
           <w14:ligatures w14:val="none"/>
         </w:rPr>
       </w:pPr>
@@ -6679,6 +6655,7 @@
           <w:kern w:val="0"/>
           <w:sz w:val="27"/>
           <w:szCs w:val="27"/>
+          <w:lang w:val="fr-FR"/>
           <w14:ligatures w14:val="none"/>
         </w:rPr>
       </w:pPr>
@@ -16528,6 +16505,7 @@
   <w:style w:type="character" w:default="1" w:styleId="DefaultParagraphFont">
     <w:name w:val="Default Paragraph Font"/>
     <w:uiPriority w:val="1"/>
+    <w:semiHidden/>
     <w:unhideWhenUsed/>
   </w:style>
   <w:style w:type="table" w:default="1" w:styleId="TableNormal">

</xml_diff>

<commit_message>
Added Kyler's video to Baseline 3 doc
</commit_message>
<xml_diff>
--- a/documentation/Meeting Logs/Baseline Sprint 3.docx
+++ b/documentation/Meeting Logs/Baseline Sprint 3.docx
@@ -2797,23 +2797,30 @@
       </w:pPr>
       <w:r>
         <w:rPr>
+          <w:sz w:val="32"/>
+          <w:szCs w:val="32"/>
+        </w:rPr>
+        <w:t xml:space="preserve">Prototype/ Demo Video </w:t>
+      </w:r>
+    </w:p>
+    <w:p>
+      <w:pPr>
+        <w:rPr>
+          <w:sz w:val="32"/>
+          <w:szCs w:val="32"/>
+        </w:rPr>
+      </w:pPr>
+      <w:r>
+        <w:rPr>
           <w:noProof/>
           <w:sz w:val="32"/>
           <w:szCs w:val="32"/>
         </w:rPr>
         <w:drawing>
-          <wp:anchor distT="0" distB="0" distL="114300" distR="114300" simplePos="0" relativeHeight="251658240" behindDoc="0" locked="0" layoutInCell="1" allowOverlap="1" wp14:anchorId="168D9671" wp14:editId="69448633">
-            <wp:simplePos x="0" y="0"/>
-            <wp:positionH relativeFrom="margin">
-              <wp:align>left</wp:align>
-            </wp:positionH>
-            <wp:positionV relativeFrom="paragraph">
-              <wp:posOffset>295275</wp:posOffset>
-            </wp:positionV>
-            <wp:extent cx="3670300" cy="2752725"/>
-            <wp:effectExtent l="0" t="0" r="6350" b="9525"/>
-            <wp:wrapTopAndBottom/>
-            <wp:docPr id="533371822" name="Video 2" descr="Find a Pump Sprint 2 demo">
+          <wp:inline distT="0" distB="0" distL="0" distR="0" wp14:anchorId="4019D531" wp14:editId="23287C3D">
+            <wp:extent cx="4572000" cy="3429000"/>
+            <wp:effectExtent l="0" t="0" r="0" b="0"/>
+            <wp:docPr id="926346723" name="Video 1" descr="Find a Pump Demo - Sprint 3">
               <a:hlinkClick xmlns:a="http://schemas.openxmlformats.org/drawingml/2006/main" r:id="rId6"/>
             </wp:docPr>
             <wp:cNvGraphicFramePr>
@@ -2823,7 +2830,7 @@
               <a:graphicData uri="http://schemas.openxmlformats.org/drawingml/2006/picture">
                 <pic:pic xmlns:pic="http://schemas.openxmlformats.org/drawingml/2006/picture">
                   <pic:nvPicPr>
-                    <pic:cNvPr id="533371822" name="Video 2" descr="Find a Pump Sprint 2 demo">
+                    <pic:cNvPr id="926346723" name="Video 1" descr="Find a Pump Demo - Sprint 3">
                       <a:hlinkClick r:id="rId6"/>
                     </pic:cNvPr>
                     <pic:cNvPicPr/>
@@ -2835,7 +2842,7 @@
                           <a14:useLocalDpi xmlns:a14="http://schemas.microsoft.com/office/drawing/2010/main" val="0"/>
                         </a:ext>
                         <a:ext uri="{C809E66F-F1BF-436E-b5F7-EEA9579F0CBA}">
-                          <wp15:webVideoPr xmlns:wp15="http://schemas.microsoft.com/office/word/2012/wordprocessingDrawing" embeddedHtml="&lt;iframe width=&quot;200&quot; height=&quot;113&quot; src=&quot;https://www.youtube.com/embed/Uhvzc2xFW7M?feature=oembed&quot; frameborder=&quot;0&quot; allow=&quot;accelerometer; autoplay; clipboard-write; encrypted-media; gyroscope; picture-in-picture; web-share&quot; referrerpolicy=&quot;strict-origin-when-cross-origin&quot; allowfullscreen=&quot;&quot; title=&quot;Find a Pump Sprint 2 demo&quot; sandbox=&quot;allow-scripts allow-same-origin allow-popups&quot;&gt;&lt;/iframe&gt;" h="113" w="200"/>
+                          <wp15:webVideoPr xmlns:wp15="http://schemas.microsoft.com/office/word/2012/wordprocessingDrawing" embeddedHtml="&lt;iframe width=&quot;200&quot; height=&quot;113&quot; src=&quot;https://www.youtube.com/embed/Nc_FKfrYoJQ?feature=oembed&quot; frameborder=&quot;0&quot; allow=&quot;accelerometer; autoplay; clipboard-write; encrypted-media; gyroscope; picture-in-picture; web-share&quot; referrerpolicy=&quot;strict-origin-when-cross-origin&quot; allowfullscreen=&quot;&quot; title=&quot;Find a Pump Demo - Sprint 3&quot; sandbox=&quot;allow-scripts allow-same-origin allow-popups&quot;&gt;&lt;/iframe&gt;" h="113" w="200"/>
                         </a:ext>
                       </a:extLst>
                     </a:blip>
@@ -2846,7 +2853,7 @@
                   <pic:spPr>
                     <a:xfrm>
                       <a:off x="0" y="0"/>
-                      <a:ext cx="3670300" cy="2752725"/>
+                      <a:ext cx="4572000" cy="3429000"/>
                     </a:xfrm>
                     <a:prstGeom prst="rect">
                       <a:avLst/>
@@ -2855,15 +2862,8 @@
                 </pic:pic>
               </a:graphicData>
             </a:graphic>
-          </wp:anchor>
+          </wp:inline>
         </w:drawing>
-      </w:r>
-      <w:r>
-        <w:rPr>
-          <w:sz w:val="32"/>
-          <w:szCs w:val="32"/>
-        </w:rPr>
-        <w:t xml:space="preserve">Prototype/ Demo Video </w:t>
       </w:r>
     </w:p>
     <w:p>
@@ -2928,6 +2928,7 @@
           <w:b/>
           <w:bCs/>
         </w:rPr>
+        <w:lastRenderedPageBreak/>
         <w:t>Architecture Diagram</w:t>
       </w:r>
     </w:p>
@@ -2936,7 +2937,6 @@
         <w:rPr>
           <w:noProof/>
         </w:rPr>
-        <w:lastRenderedPageBreak/>
         <w:drawing>
           <wp:inline distT="0" distB="0" distL="0" distR="0" wp14:anchorId="57FC23BA" wp14:editId="41636F0B">
             <wp:extent cx="5943600" cy="2402890"/>
@@ -3104,6 +3104,7 @@
           <w:b/>
           <w:bCs/>
         </w:rPr>
+        <w:lastRenderedPageBreak/>
         <w:t>Use Case Diagram</w:t>
       </w:r>
     </w:p>
@@ -3118,7 +3119,6 @@
         <w:rPr>
           <w:noProof/>
         </w:rPr>
-        <w:lastRenderedPageBreak/>
         <w:drawing>
           <wp:inline distT="0" distB="0" distL="0" distR="0" wp14:anchorId="09911750" wp14:editId="1E3803E6">
             <wp:extent cx="4647063" cy="4977720"/>
@@ -3281,6 +3281,7 @@
           <w:b/>
           <w:bCs/>
         </w:rPr>
+        <w:lastRenderedPageBreak/>
         <w:t>Implemented</w:t>
       </w:r>
       <w:r>
@@ -3307,7 +3308,6 @@
         </w:numPr>
       </w:pPr>
       <w:r>
-        <w:lastRenderedPageBreak/>
         <w:t>Homepage only renders MapView.</w:t>
       </w:r>
     </w:p>
@@ -3623,6 +3623,7 @@
         </w:numPr>
       </w:pPr>
       <w:r>
+        <w:lastRenderedPageBreak/>
         <w:t>No dedicated cache refresh scheduler, offline synchronization job, or stale-data policy.</w:t>
       </w:r>
     </w:p>
@@ -3635,7 +3636,6 @@
         </w:numPr>
       </w:pPr>
       <w:r>
-        <w:lastRenderedPageBreak/>
         <w:t>Input validation is limited to a few numeric query checks in MapsController; there is no shared validation middleware.</w:t>
       </w:r>
     </w:p>
@@ -4603,6 +4603,7 @@
           <w:bCs/>
           <w:color w:val="000000"/>
         </w:rPr>
+        <w:lastRenderedPageBreak/>
         <w:t>Action Taken:</w:t>
       </w:r>
       <w:r>
@@ -4650,7 +4651,6 @@
           <w:rFonts w:ascii="Aptos" w:hAnsi="Aptos"/>
           <w:color w:val="000000"/>
         </w:rPr>
-        <w:lastRenderedPageBreak/>
         <w:t>Numbered functional and non-functional requirements.</w:t>
       </w:r>
     </w:p>
@@ -5096,6 +5096,7 @@
           <w:bCs/>
           <w:color w:val="000000"/>
         </w:rPr>
+        <w:lastRenderedPageBreak/>
         <w:t>Interpretation:</w:t>
       </w:r>
       <w:r>
@@ -5153,7 +5154,6 @@
           <w:rFonts w:ascii="Aptos" w:hAnsi="Aptos"/>
           <w:color w:val="000000"/>
         </w:rPr>
-        <w:lastRenderedPageBreak/>
         <w:t xml:space="preserve">Add support for EV charging station data in the backend. </w:t>
       </w:r>
     </w:p>
@@ -5561,6 +5561,7 @@
     </w:p>
     <w:p>
       <w:r>
+        <w:lastRenderedPageBreak/>
         <w:t>The testing environments will be finalized by the end of sprint 2. It will most likely include multiple browser types, device types, online and offline modes, and location services allowed and blocked.</w:t>
       </w:r>
     </w:p>
@@ -5575,7 +5576,6 @@
     </w:p>
     <w:p>
       <w:r>
-        <w:lastRenderedPageBreak/>
         <w:t>Test cases will be finalized by the end of sprint 2. They will cover the expected scope of the testing plan with pass/fail information included.</w:t>
       </w:r>
     </w:p>
@@ -5680,6 +5680,7 @@
           <w:b/>
           <w:bCs/>
         </w:rPr>
+        <w:lastRenderedPageBreak/>
         <w:t>Process metric:</w:t>
       </w:r>
     </w:p>
@@ -5688,11 +5689,7 @@
         <w:t> </w:t>
       </w:r>
       <w:r>
-        <w:t xml:space="preserve">To ensure that Find a Pump is released in a timely manner, sprint velocity will be monitored and evaluated. Tracking sprint velocity allows the team to measure how much </w:t>
-      </w:r>
-      <w:r>
-        <w:lastRenderedPageBreak/>
-        <w:t>work is completed per sprint, improve planning accuracy, and identify potential slowdowns, while still maintaining a strong focus on quality.</w:t>
+        <w:t>To ensure that Find a Pump is released in a timely manner, sprint velocity will be monitored and evaluated. Tracking sprint velocity allows the team to measure how much work is completed per sprint, improve planning accuracy, and identify potential slowdowns, while still maintaining a strong focus on quality.</w:t>
       </w:r>
     </w:p>
     <w:p>
@@ -6669,6 +6666,7 @@
           <w:lang w:val="fr-FR"/>
           <w14:ligatures w14:val="none"/>
         </w:rPr>
+        <w:lastRenderedPageBreak/>
         <w:t>Prerequisites</w:t>
       </w:r>
     </w:p>
@@ -6769,7 +6767,6 @@
           <w:kern w:val="0"/>
           <w14:ligatures w14:val="none"/>
         </w:rPr>
-        <w:lastRenderedPageBreak/>
         <w:t>npm install -g pnpm</w:t>
       </w:r>
     </w:p>
@@ -7928,6 +7925,7 @@
           <w:shd w:val="clear" w:color="auto" w:fill="3C3C3C"/>
           <w14:ligatures w14:val="none"/>
         </w:rPr>
+        <w:lastRenderedPageBreak/>
         <w:t>services/</w:t>
       </w:r>
       <w:r>
@@ -8042,7 +8040,6 @@
           <w:kern w:val="0"/>
           <w14:ligatures w14:val="none"/>
         </w:rPr>
-        <w:lastRenderedPageBreak/>
         <w:t>From the find-a-pump-code directory:</w:t>
       </w:r>
     </w:p>
@@ -9024,7 +9021,19 @@
                 <w:szCs w:val="28"/>
                 <w14:ligatures w14:val="none"/>
               </w:rPr>
-              <w:t xml:space="preserve">Project Description (description and justificaiton </w:t>
+              <w:t xml:space="preserve">Project Description (description </w:t>
+            </w:r>
+            <w:r>
+              <w:rPr>
+                <w:rFonts w:ascii="Noto Serif CJK SC" w:eastAsia="Times New Roman" w:hAnsi="Noto Serif CJK SC" w:cs="Times New Roman"/>
+                <w:color w:val="000000"/>
+                <w:kern w:val="0"/>
+                <w:sz w:val="28"/>
+                <w:szCs w:val="28"/>
+                <w14:ligatures w14:val="none"/>
+              </w:rPr>
+              <w:lastRenderedPageBreak/>
+              <w:t xml:space="preserve">and justificaiton </w:t>
             </w:r>
           </w:p>
         </w:tc>
@@ -9050,6 +9059,7 @@
                 <w:szCs w:val="28"/>
                 <w14:ligatures w14:val="none"/>
               </w:rPr>
+              <w:lastRenderedPageBreak/>
               <w:t>Medium</w:t>
             </w:r>
           </w:p>
@@ -9130,7 +9140,6 @@
                 <w:szCs w:val="28"/>
                 <w14:ligatures w14:val="none"/>
               </w:rPr>
-              <w:lastRenderedPageBreak/>
               <w:t>1d</w:t>
             </w:r>
           </w:p>
@@ -10847,6 +10856,7 @@
                 <w:szCs w:val="28"/>
                 <w14:ligatures w14:val="none"/>
               </w:rPr>
+              <w:lastRenderedPageBreak/>
               <w:t>1r</w:t>
             </w:r>
           </w:p>
@@ -10979,7 +10989,6 @@
                 <w:szCs w:val="28"/>
                 <w14:ligatures w14:val="none"/>
               </w:rPr>
-              <w:lastRenderedPageBreak/>
               <w:t>1q</w:t>
             </w:r>
           </w:p>
@@ -12562,6 +12571,7 @@
                 <w:szCs w:val="28"/>
                 <w14:ligatures w14:val="none"/>
               </w:rPr>
+              <w:lastRenderedPageBreak/>
               <w:t>2j</w:t>
             </w:r>
           </w:p>
@@ -16505,7 +16515,6 @@
   <w:style w:type="character" w:default="1" w:styleId="DefaultParagraphFont">
     <w:name w:val="Default Paragraph Font"/>
     <w:uiPriority w:val="1"/>
-    <w:semiHidden/>
     <w:unhideWhenUsed/>
   </w:style>
   <w:style w:type="table" w:default="1" w:styleId="TableNormal">

</xml_diff>

<commit_message>
Update to class diagram and changes to baseline 3
</commit_message>
<xml_diff>
--- a/documentation/Meeting Logs/Baseline Sprint 3.docx
+++ b/documentation/Meeting Logs/Baseline Sprint 3.docx
@@ -3476,16 +3476,24 @@
     </w:p>
     <w:p>
       <w:pPr>
-        <w:ind w:firstLine="720"/>
-        <w:rPr>
+        <w:pStyle w:val="docxheading1"/>
+        <w:shd w:val="clear" w:color="auto" w:fill="FFFFFF"/>
+        <w:spacing w:after="0" w:line="480" w:lineRule="auto"/>
+        <w:rPr>
+          <w:rFonts w:asciiTheme="minorHAnsi" w:eastAsiaTheme="minorHAnsi" w:hAnsiTheme="minorHAnsi" w:cstheme="minorBidi"/>
           <w:b/>
           <w:bCs/>
-        </w:rPr>
-      </w:pPr>
-      <w:r>
-        <w:rPr>
+          <w:kern w:val="2"/>
+          <w14:ligatures w14:val="standardContextual"/>
+        </w:rPr>
+      </w:pPr>
+      <w:r>
+        <w:rPr>
+          <w:rFonts w:asciiTheme="minorHAnsi" w:eastAsiaTheme="minorHAnsi" w:hAnsiTheme="minorHAnsi" w:cstheme="minorBidi"/>
           <w:b/>
           <w:bCs/>
+          <w:kern w:val="2"/>
+          <w14:ligatures w14:val="standardContextual"/>
         </w:rPr>
         <w:t>Implemented now:</w:t>
       </w:r>
@@ -3494,185 +3502,202 @@
       <w:pPr>
         <w:pStyle w:val="ListParagraph"/>
         <w:numPr>
-          <w:ilvl w:val="0"/>
-          <w:numId w:val="20"/>
+          <w:ilvl w:val="1"/>
+          <w:numId w:val="18"/>
         </w:numPr>
       </w:pPr>
       <w:r>
-        <w:t>Express app wiring with CORS and JSON middleware.</w:t>
+        <w:t>Express app with CORS allowlist + private-network pattern and JSON middleware.</w:t>
       </w:r>
     </w:p>
     <w:p>
       <w:pPr>
         <w:pStyle w:val="ListParagraph"/>
         <w:numPr>
-          <w:ilvl w:val="0"/>
-          <w:numId w:val="20"/>
+          <w:ilvl w:val="1"/>
+          <w:numId w:val="18"/>
         </w:numPr>
       </w:pPr>
       <w:r>
-        <w:t>Route, controller, and service separation for stations, maps, and prices.</w:t>
+        <w:t>Route/controller/service separation for station, map, and price APIs.</w:t>
       </w:r>
     </w:p>
     <w:p>
       <w:pPr>
         <w:pStyle w:val="ListParagraph"/>
         <w:numPr>
-          <w:ilvl w:val="0"/>
-          <w:numId w:val="20"/>
+          <w:ilvl w:val="1"/>
+          <w:numId w:val="18"/>
         </w:numPr>
       </w:pPr>
       <w:r>
-        <w:t xml:space="preserve">MapsService calls the Google Places API, returns nearby gas and EVstations, and asynchronously </w:t>
-      </w:r>
-      <w:r>
-        <w:t>in</w:t>
-      </w:r>
-      <w:r>
-        <w:t>serts station/location/brand cache data intoPrisma.</w:t>
+        <w:t>Maps service fetches gas and EV places, returns combined results, and persists station/location/brand cache asynchronously.</w:t>
       </w:r>
     </w:p>
     <w:p>
       <w:pPr>
         <w:pStyle w:val="ListParagraph"/>
         <w:numPr>
-          <w:ilvl w:val="0"/>
-          <w:numId w:val="20"/>
+          <w:ilvl w:val="1"/>
+          <w:numId w:val="18"/>
         </w:numPr>
       </w:pPr>
       <w:r>
-        <w:t>StationService returns stations with Location, StationBrand, and sortedFuelPrice relations.</w:t>
+        <w:t>Cached map endpoint reads local DB and includes fresh fuel prices (24h threshold).</w:t>
       </w:r>
     </w:p>
     <w:p>
       <w:pPr>
         <w:pStyle w:val="ListParagraph"/>
         <w:numPr>
-          <w:ilvl w:val="0"/>
-          <w:numId w:val="20"/>
+          <w:ilvl w:val="1"/>
+          <w:numId w:val="18"/>
         </w:numPr>
       </w:pPr>
       <w:r>
-        <w:t>Prisma entities exist for users, user config, fuel types, fuel prices, stations,</w:t>
-      </w:r>
-      <w:r>
-        <w:t xml:space="preserve"> </w:t>
-      </w:r>
-      <w:r>
-        <w:t>locations, and brands.</w:t>
+        <w:t>Price service calls Google Places Details API (v1), normalizes fuel prices, and upserts FuelType/FuelPrice rows asynchronously.</w:t>
       </w:r>
     </w:p>
     <w:p>
       <w:pPr>
         <w:pStyle w:val="ListParagraph"/>
         <w:numPr>
-          <w:ilvl w:val="0"/>
-          <w:numId w:val="20"/>
+          <w:ilvl w:val="1"/>
+          <w:numId w:val="18"/>
         </w:numPr>
       </w:pPr>
       <w:r>
-        <w:t>Basic automated tests exist for the frontend map component and the stationcontroller/service layers.</w:t>
-      </w:r>
-    </w:p>
-    <w:p>
-      <w:pPr>
-        <w:ind w:firstLine="720"/>
-        <w:rPr>
+        <w:t>Station service returns related location/brand/fuel data, with fuel prices sorted ascending.</w:t>
+      </w:r>
+    </w:p>
+    <w:p>
+      <w:pPr>
+        <w:pStyle w:val="ListParagraph"/>
+        <w:numPr>
+          <w:ilvl w:val="1"/>
+          <w:numId w:val="18"/>
+        </w:numPr>
+      </w:pPr>
+      <w:r>
+        <w:t>Prisma entities for user config, fuel types, stations, locations, brands, and fuel prices are in schema.</w:t>
+      </w:r>
+    </w:p>
+    <w:p>
+      <w:pPr>
+        <w:pStyle w:val="docxheading1"/>
+        <w:shd w:val="clear" w:color="auto" w:fill="FFFFFF"/>
+        <w:spacing w:after="0" w:line="480" w:lineRule="auto"/>
+        <w:rPr>
+          <w:rFonts w:asciiTheme="minorHAnsi" w:eastAsiaTheme="minorHAnsi" w:hAnsiTheme="minorHAnsi" w:cstheme="minorBidi"/>
           <w:b/>
           <w:bCs/>
-        </w:rPr>
-      </w:pPr>
-      <w:r>
-        <w:rPr>
+          <w:kern w:val="2"/>
+          <w14:ligatures w14:val="standardContextual"/>
+        </w:rPr>
+      </w:pPr>
+      <w:r>
+        <w:rPr>
+          <w:rFonts w:asciiTheme="minorHAnsi" w:eastAsiaTheme="minorHAnsi" w:hAnsiTheme="minorHAnsi" w:cstheme="minorBidi"/>
           <w:b/>
           <w:bCs/>
-        </w:rPr>
-        <w:t>Partial or missing relative to the SRS:</w:t>
+          <w:kern w:val="2"/>
+          <w14:ligatures w14:val="standardContextual"/>
+        </w:rPr>
+        <w:t>Partial/missing relative to SRS:</w:t>
       </w:r>
     </w:p>
     <w:p>
       <w:pPr>
         <w:pStyle w:val="ListParagraph"/>
         <w:numPr>
-          <w:ilvl w:val="0"/>
-          <w:numId w:val="19"/>
+          <w:ilvl w:val="1"/>
+          <w:numId w:val="18"/>
         </w:numPr>
       </w:pPr>
       <w:r>
-        <w:t>PriceService is still a stub and does not expose real pricing logic.</w:t>
+        <w:lastRenderedPageBreak/>
+        <w:t>“</w:t>
+      </w:r>
+      <w:r>
+        <w:t>getAllPrices()</w:t>
+      </w:r>
+      <w:r>
+        <w:t>”</w:t>
+      </w:r>
+      <w:r>
+        <w:t xml:space="preserve"> still returns a stub object.</w:t>
       </w:r>
     </w:p>
     <w:p>
       <w:pPr>
         <w:pStyle w:val="ListParagraph"/>
         <w:numPr>
-          <w:ilvl w:val="0"/>
-          <w:numId w:val="19"/>
+          <w:ilvl w:val="1"/>
+          <w:numId w:val="18"/>
         </w:numPr>
       </w:pPr>
       <w:r>
-        <w:t>No backend discount-program model or CRUD endpoints.</w:t>
+        <w:t>No discount-program domain model or CRUD endpoints.</w:t>
       </w:r>
     </w:p>
     <w:p>
       <w:pPr>
         <w:pStyle w:val="ListParagraph"/>
         <w:numPr>
-          <w:ilvl w:val="0"/>
-          <w:numId w:val="19"/>
+          <w:ilvl w:val="1"/>
+          <w:numId w:val="18"/>
         </w:numPr>
       </w:pPr>
       <w:r>
-        <w:lastRenderedPageBreak/>
-        <w:t>No dedicated cache refresh scheduler, offline synchronization job, or stale-data policy.</w:t>
+        <w:t>No scheduled cache refresh worker/service.</w:t>
       </w:r>
     </w:p>
     <w:p>
       <w:pPr>
         <w:pStyle w:val="ListParagraph"/>
         <w:numPr>
-          <w:ilvl w:val="0"/>
-          <w:numId w:val="19"/>
+          <w:ilvl w:val="1"/>
+          <w:numId w:val="18"/>
         </w:numPr>
       </w:pPr>
       <w:r>
-        <w:t>Input validation is limited to a few numeric query checks in MapsController; there is no shared validation middleware.</w:t>
+        <w:t>Validation is handler-local only (no shared validation middleware layer).</w:t>
       </w:r>
     </w:p>
     <w:p>
       <w:pPr>
         <w:pStyle w:val="ListParagraph"/>
         <w:numPr>
-          <w:ilvl w:val="0"/>
-          <w:numId w:val="19"/>
+          <w:ilvl w:val="1"/>
+          <w:numId w:val="18"/>
         </w:numPr>
       </w:pPr>
       <w:r>
-        <w:t>No API rate limiting.</w:t>
+        <w:t>No rate limiting middleware.</w:t>
       </w:r>
     </w:p>
     <w:p>
       <w:pPr>
         <w:pStyle w:val="ListParagraph"/>
         <w:numPr>
-          <w:ilvl w:val="0"/>
-          <w:numId w:val="19"/>
+          <w:ilvl w:val="1"/>
+          <w:numId w:val="18"/>
         </w:numPr>
       </w:pPr>
       <w:r>
-        <w:t>Logging is ad hoc console logging plus a Google Maps API log file, not fullmonitoring/alerting.</w:t>
+        <w:t>Logging is ad hoc (`console` plus append-to-file), not full monitoring/alerting.</w:t>
       </w:r>
     </w:p>
     <w:p>
       <w:pPr>
         <w:pStyle w:val="ListParagraph"/>
         <w:numPr>
-          <w:ilvl w:val="0"/>
-          <w:numId w:val="19"/>
+          <w:ilvl w:val="1"/>
+          <w:numId w:val="18"/>
         </w:numPr>
       </w:pPr>
       <w:r>
-        <w:t>No backup/recovery module in the application code.</w:t>
+        <w:t>No backup/recovery application module.</w:t>
       </w:r>
     </w:p>
     <w:p>
@@ -4573,6 +4598,7 @@
           <w:bCs/>
           <w:color w:val="000000"/>
         </w:rPr>
+        <w:lastRenderedPageBreak/>
         <w:t>Feedback:</w:t>
       </w:r>
       <w:r>
@@ -4603,7 +4629,6 @@
           <w:bCs/>
           <w:color w:val="000000"/>
         </w:rPr>
-        <w:lastRenderedPageBreak/>
         <w:t>Action Taken:</w:t>
       </w:r>
       <w:r>
@@ -5066,6 +5091,7 @@
           <w:bCs/>
           <w:color w:val="000000"/>
         </w:rPr>
+        <w:lastRenderedPageBreak/>
         <w:t>Feedback:</w:t>
       </w:r>
       <w:r>
@@ -5096,7 +5122,6 @@
           <w:bCs/>
           <w:color w:val="000000"/>
         </w:rPr>
-        <w:lastRenderedPageBreak/>
         <w:t>Interpretation:</w:t>
       </w:r>
       <w:r>
@@ -5556,12 +5581,12 @@
           <w:b/>
           <w:bCs/>
         </w:rPr>
+        <w:lastRenderedPageBreak/>
         <w:t>Test Environment:</w:t>
       </w:r>
     </w:p>
     <w:p>
       <w:r>
-        <w:lastRenderedPageBreak/>
         <w:t>The testing environments will be finalized by the end of sprint 2. It will most likely include multiple browser types, device types, online and offline modes, and location services allowed and blocked.</w:t>
       </w:r>
     </w:p>
@@ -5671,7 +5696,11 @@
         <w:t> </w:t>
       </w:r>
       <w:r>
-        <w:t>Find a Pump is committed to maintaining a high defect removal efficiency (DRE) in order to catch as many defects as possible before release. This metric measures the proportion of defects found before deployment compared to those found after release. A high DRE reduces the number of escaped defects and helps ensure a higher quality product for end users.</w:t>
+        <w:t xml:space="preserve">Find a Pump is committed to maintaining a high defect removal efficiency (DRE) in order to catch as many defects as possible before release. This metric measures the proportion of defects found before deployment compared to those found after release. A high DRE </w:t>
+      </w:r>
+      <w:r>
+        <w:lastRenderedPageBreak/>
+        <w:t>reduces the number of escaped defects and helps ensure a higher quality product for end users.</w:t>
       </w:r>
     </w:p>
     <w:p>
@@ -5680,7 +5709,6 @@
           <w:b/>
           <w:bCs/>
         </w:rPr>
-        <w:lastRenderedPageBreak/>
         <w:t>Process metric:</w:t>
       </w:r>
     </w:p>
@@ -6517,6 +6545,7 @@
           <w:lang w:val="fr-FR"/>
           <w14:ligatures w14:val="none"/>
         </w:rPr>
+        <w:lastRenderedPageBreak/>
         <w:t xml:space="preserve">│ </w:t>
       </w:r>
       <w:r>
@@ -6666,7 +6695,6 @@
           <w:lang w:val="fr-FR"/>
           <w14:ligatures w14:val="none"/>
         </w:rPr>
-        <w:lastRenderedPageBreak/>
         <w:t>Prerequisites</w:t>
       </w:r>
     </w:p>
@@ -7814,6 +7842,7 @@
           <w:kern w:val="0"/>
           <w14:ligatures w14:val="none"/>
         </w:rPr>
+        <w:lastRenderedPageBreak/>
         <w:t>The backend uses structured separation:</w:t>
       </w:r>
     </w:p>
@@ -7925,7 +7954,6 @@
           <w:shd w:val="clear" w:color="auto" w:fill="3C3C3C"/>
           <w14:ligatures w14:val="none"/>
         </w:rPr>
-        <w:lastRenderedPageBreak/>
         <w:t>services/</w:t>
       </w:r>
       <w:r>
@@ -8995,6 +9023,7 @@
                 <w:szCs w:val="28"/>
                 <w14:ligatures w14:val="none"/>
               </w:rPr>
+              <w:lastRenderedPageBreak/>
               <w:t xml:space="preserve">1c </w:t>
             </w:r>
           </w:p>
@@ -9021,8 +9050,23 @@
                 <w:szCs w:val="28"/>
                 <w14:ligatures w14:val="none"/>
               </w:rPr>
-              <w:t xml:space="preserve">Project Description (description </w:t>
-            </w:r>
+              <w:t xml:space="preserve">Project Description (description and justificaiton </w:t>
+            </w:r>
+          </w:p>
+        </w:tc>
+        <w:tc>
+          <w:tcPr>
+            <w:tcW w:w="1764" w:type="dxa"/>
+            <w:hideMark/>
+          </w:tcPr>
+          <w:p>
+            <w:pPr>
+              <w:rPr>
+                <w:rFonts w:ascii="Times New Roman" w:eastAsia="Times New Roman" w:hAnsi="Times New Roman" w:cs="Times New Roman"/>
+                <w:kern w:val="0"/>
+                <w14:ligatures w14:val="none"/>
+              </w:rPr>
+            </w:pPr>
             <w:r>
               <w:rPr>
                 <w:rFonts w:ascii="Noto Serif CJK SC" w:eastAsia="Times New Roman" w:hAnsi="Noto Serif CJK SC" w:cs="Times New Roman"/>
@@ -9032,8 +9076,113 @@
                 <w:szCs w:val="28"/>
                 <w14:ligatures w14:val="none"/>
               </w:rPr>
-              <w:lastRenderedPageBreak/>
-              <w:t xml:space="preserve">and justificaiton </w:t>
+              <w:t>Medium</w:t>
+            </w:r>
+          </w:p>
+        </w:tc>
+        <w:tc>
+          <w:tcPr>
+            <w:tcW w:w="2253" w:type="dxa"/>
+            <w:hideMark/>
+          </w:tcPr>
+          <w:p>
+            <w:pPr>
+              <w:rPr>
+                <w:rFonts w:ascii="Times New Roman" w:eastAsia="Times New Roman" w:hAnsi="Times New Roman" w:cs="Times New Roman"/>
+                <w:kern w:val="0"/>
+                <w14:ligatures w14:val="none"/>
+              </w:rPr>
+            </w:pPr>
+            <w:r>
+              <w:rPr>
+                <w:rFonts w:ascii="Noto Serif CJK SC" w:eastAsia="Times New Roman" w:hAnsi="Noto Serif CJK SC" w:cs="Times New Roman"/>
+                <w:color w:val="000000"/>
+                <w:kern w:val="0"/>
+                <w:sz w:val="28"/>
+                <w:szCs w:val="28"/>
+                <w14:ligatures w14:val="none"/>
+              </w:rPr>
+              <w:t>Complete</w:t>
+            </w:r>
+          </w:p>
+        </w:tc>
+        <w:tc>
+          <w:tcPr>
+            <w:tcW w:w="3510" w:type="dxa"/>
+            <w:hideMark/>
+          </w:tcPr>
+          <w:p>
+            <w:pPr>
+              <w:rPr>
+                <w:rFonts w:ascii="Times New Roman" w:eastAsia="Times New Roman" w:hAnsi="Times New Roman" w:cs="Times New Roman"/>
+                <w:kern w:val="0"/>
+                <w14:ligatures w14:val="none"/>
+              </w:rPr>
+            </w:pPr>
+            <w:r>
+              <w:rPr>
+                <w:rFonts w:ascii="Noto Serif CJK SC" w:eastAsia="Times New Roman" w:hAnsi="Noto Serif CJK SC" w:cs="Times New Roman"/>
+                <w:color w:val="000000"/>
+                <w:kern w:val="0"/>
+                <w:sz w:val="28"/>
+                <w:szCs w:val="28"/>
+                <w14:ligatures w14:val="none"/>
+              </w:rPr>
+              <w:t>Nate C</w:t>
+            </w:r>
+          </w:p>
+        </w:tc>
+      </w:tr>
+      <w:tr>
+        <w:tc>
+          <w:tcPr>
+            <w:tcW w:w="605" w:type="dxa"/>
+            <w:hideMark/>
+          </w:tcPr>
+          <w:p>
+            <w:pPr>
+              <w:rPr>
+                <w:rFonts w:ascii="Times New Roman" w:eastAsia="Times New Roman" w:hAnsi="Times New Roman" w:cs="Times New Roman"/>
+                <w:kern w:val="0"/>
+                <w14:ligatures w14:val="none"/>
+              </w:rPr>
+            </w:pPr>
+            <w:r>
+              <w:rPr>
+                <w:rFonts w:ascii="Noto Serif CJK SC" w:eastAsia="Times New Roman" w:hAnsi="Noto Serif CJK SC" w:cs="Times New Roman"/>
+                <w:color w:val="000000"/>
+                <w:kern w:val="0"/>
+                <w:sz w:val="28"/>
+                <w:szCs w:val="28"/>
+                <w14:ligatures w14:val="none"/>
+              </w:rPr>
+              <w:t>1d</w:t>
+            </w:r>
+          </w:p>
+        </w:tc>
+        <w:tc>
+          <w:tcPr>
+            <w:tcW w:w="2033" w:type="dxa"/>
+            <w:hideMark/>
+          </w:tcPr>
+          <w:p>
+            <w:pPr>
+              <w:rPr>
+                <w:rFonts w:ascii="Times New Roman" w:eastAsia="Times New Roman" w:hAnsi="Times New Roman" w:cs="Times New Roman"/>
+                <w:kern w:val="0"/>
+                <w14:ligatures w14:val="none"/>
+              </w:rPr>
+            </w:pPr>
+            <w:r>
+              <w:rPr>
+                <w:rFonts w:ascii="Noto Serif CJK SC" w:eastAsia="Times New Roman" w:hAnsi="Noto Serif CJK SC" w:cs="Times New Roman"/>
+                <w:color w:val="000000"/>
+                <w:kern w:val="0"/>
+                <w:sz w:val="28"/>
+                <w:szCs w:val="28"/>
+                <w14:ligatures w14:val="none"/>
+              </w:rPr>
+              <w:t>Project Description (API research and Google maps API)</w:t>
             </w:r>
           </w:p>
         </w:tc>
@@ -9059,7 +9208,6 @@
                 <w:szCs w:val="28"/>
                 <w14:ligatures w14:val="none"/>
               </w:rPr>
-              <w:lastRenderedPageBreak/>
               <w:t>Medium</w:t>
             </w:r>
           </w:p>
@@ -9112,7 +9260,7 @@
                 <w:szCs w:val="28"/>
                 <w14:ligatures w14:val="none"/>
               </w:rPr>
-              <w:t>Nate C</w:t>
+              <w:t>Kyler C</w:t>
             </w:r>
           </w:p>
         </w:tc>
@@ -9140,7 +9288,7 @@
                 <w:szCs w:val="28"/>
                 <w14:ligatures w14:val="none"/>
               </w:rPr>
-              <w:t>1d</w:t>
+              <w:t>1e</w:t>
             </w:r>
           </w:p>
         </w:tc>
@@ -9166,7 +9314,7 @@
                 <w:szCs w:val="28"/>
                 <w14:ligatures w14:val="none"/>
               </w:rPr>
-              <w:t>Project Description (API research and Google maps API)</w:t>
+              <w:t>Project Description (Potential features and stakeholders)</w:t>
             </w:r>
           </w:p>
         </w:tc>
@@ -9244,7 +9392,7 @@
                 <w:szCs w:val="28"/>
                 <w14:ligatures w14:val="none"/>
               </w:rPr>
-              <w:t>Kyler C</w:t>
+              <w:t>Thomas R</w:t>
             </w:r>
           </w:p>
         </w:tc>
@@ -9272,7 +9420,7 @@
                 <w:szCs w:val="28"/>
                 <w14:ligatures w14:val="none"/>
               </w:rPr>
-              <w:t>1e</w:t>
+              <w:t>1f</w:t>
             </w:r>
           </w:p>
         </w:tc>
@@ -9298,7 +9446,7 @@
                 <w:szCs w:val="28"/>
                 <w14:ligatures w14:val="none"/>
               </w:rPr>
-              <w:t>Project Description (Potential features and stakeholders)</w:t>
+              <w:t>Project Description (Tech stack and measuring success)</w:t>
             </w:r>
           </w:p>
         </w:tc>
@@ -9376,7 +9524,7 @@
                 <w:szCs w:val="28"/>
                 <w14:ligatures w14:val="none"/>
               </w:rPr>
-              <w:t>Thomas R</w:t>
+              <w:t>Eric P</w:t>
             </w:r>
           </w:p>
         </w:tc>
@@ -9404,7 +9552,7 @@
                 <w:szCs w:val="28"/>
                 <w14:ligatures w14:val="none"/>
               </w:rPr>
-              <w:t>1f</w:t>
+              <w:t>1g</w:t>
             </w:r>
           </w:p>
         </w:tc>
@@ -9430,7 +9578,7 @@
                 <w:szCs w:val="28"/>
                 <w14:ligatures w14:val="none"/>
               </w:rPr>
-              <w:t>Project Description (Tech stack and measuring success)</w:t>
+              <w:t>Functional Requirements Outline</w:t>
             </w:r>
           </w:p>
         </w:tc>
@@ -9508,7 +9656,7 @@
                 <w:szCs w:val="28"/>
                 <w14:ligatures w14:val="none"/>
               </w:rPr>
-              <w:t>Eric P</w:t>
+              <w:t>Nate C, Kyler C</w:t>
             </w:r>
           </w:p>
         </w:tc>
@@ -9536,7 +9684,7 @@
                 <w:szCs w:val="28"/>
                 <w14:ligatures w14:val="none"/>
               </w:rPr>
-              <w:t>1g</w:t>
+              <w:t>1h</w:t>
             </w:r>
           </w:p>
         </w:tc>
@@ -9562,7 +9710,7 @@
                 <w:szCs w:val="28"/>
                 <w14:ligatures w14:val="none"/>
               </w:rPr>
-              <w:t>Functional Requirements Outline</w:t>
+              <w:t>Non-functional Requirements Outline</w:t>
             </w:r>
           </w:p>
         </w:tc>
@@ -9640,7 +9788,7 @@
                 <w:szCs w:val="28"/>
                 <w14:ligatures w14:val="none"/>
               </w:rPr>
-              <w:t>Nate C, Kyler C</w:t>
+              <w:t>Thomas R, Eric P</w:t>
             </w:r>
           </w:p>
         </w:tc>
@@ -9668,7 +9816,7 @@
                 <w:szCs w:val="28"/>
                 <w14:ligatures w14:val="none"/>
               </w:rPr>
-              <w:t>1h</w:t>
+              <w:t>1i</w:t>
             </w:r>
           </w:p>
         </w:tc>
@@ -9694,7 +9842,7 @@
                 <w:szCs w:val="28"/>
                 <w14:ligatures w14:val="none"/>
               </w:rPr>
-              <w:t>Non-functional Requirements Outline</w:t>
+              <w:t>Class Diagram</w:t>
             </w:r>
           </w:p>
         </w:tc>
@@ -9772,7 +9920,7 @@
                 <w:szCs w:val="28"/>
                 <w14:ligatures w14:val="none"/>
               </w:rPr>
-              <w:t>Thomas R, Eric P</w:t>
+              <w:t>Eric P</w:t>
             </w:r>
           </w:p>
         </w:tc>
@@ -9800,7 +9948,7 @@
                 <w:szCs w:val="28"/>
                 <w14:ligatures w14:val="none"/>
               </w:rPr>
-              <w:t>1i</w:t>
+              <w:t>1j</w:t>
             </w:r>
           </w:p>
         </w:tc>
@@ -9826,7 +9974,7 @@
                 <w:szCs w:val="28"/>
                 <w14:ligatures w14:val="none"/>
               </w:rPr>
-              <w:t>Class Diagram</w:t>
+              <w:t>Use Case Diagram</w:t>
             </w:r>
           </w:p>
         </w:tc>
@@ -9904,7 +10052,7 @@
                 <w:szCs w:val="28"/>
                 <w14:ligatures w14:val="none"/>
               </w:rPr>
-              <w:t>Eric P</w:t>
+              <w:t>Nate C</w:t>
             </w:r>
           </w:p>
         </w:tc>
@@ -9932,7 +10080,7 @@
                 <w:szCs w:val="28"/>
                 <w14:ligatures w14:val="none"/>
               </w:rPr>
-              <w:t>1j</w:t>
+              <w:t>1k</w:t>
             </w:r>
           </w:p>
         </w:tc>
@@ -9958,7 +10106,7 @@
                 <w:szCs w:val="28"/>
                 <w14:ligatures w14:val="none"/>
               </w:rPr>
-              <w:t>Use Case Diagram</w:t>
+              <w:t>ERM Diagram</w:t>
             </w:r>
           </w:p>
         </w:tc>
@@ -10036,7 +10184,7 @@
                 <w:szCs w:val="28"/>
                 <w14:ligatures w14:val="none"/>
               </w:rPr>
-              <w:t>Nate C</w:t>
+              <w:t>Kyler C</w:t>
             </w:r>
           </w:p>
         </w:tc>
@@ -10064,7 +10212,7 @@
                 <w:szCs w:val="28"/>
                 <w14:ligatures w14:val="none"/>
               </w:rPr>
-              <w:t>1k</w:t>
+              <w:t>1l</w:t>
             </w:r>
           </w:p>
         </w:tc>
@@ -10090,7 +10238,7 @@
                 <w:szCs w:val="28"/>
                 <w14:ligatures w14:val="none"/>
               </w:rPr>
-              <w:t>ERM Diagram</w:t>
+              <w:t>Architecture Diagram</w:t>
             </w:r>
           </w:p>
         </w:tc>
@@ -10168,7 +10316,7 @@
                 <w:szCs w:val="28"/>
                 <w14:ligatures w14:val="none"/>
               </w:rPr>
-              <w:t>Kyler C</w:t>
+              <w:t>Thomas R</w:t>
             </w:r>
           </w:p>
         </w:tc>
@@ -10196,7 +10344,7 @@
                 <w:szCs w:val="28"/>
                 <w14:ligatures w14:val="none"/>
               </w:rPr>
-              <w:t>1l</w:t>
+              <w:t>1m</w:t>
             </w:r>
           </w:p>
         </w:tc>
@@ -10222,7 +10370,7 @@
                 <w:szCs w:val="28"/>
                 <w14:ligatures w14:val="none"/>
               </w:rPr>
-              <w:t>Architecture Diagram</w:t>
+              <w:t xml:space="preserve">Setup Google Maps API Key </w:t>
             </w:r>
           </w:p>
         </w:tc>
@@ -10300,7 +10448,7 @@
                 <w:szCs w:val="28"/>
                 <w14:ligatures w14:val="none"/>
               </w:rPr>
-              <w:t>Thomas R</w:t>
+              <w:t>Nate C</w:t>
             </w:r>
           </w:p>
         </w:tc>
@@ -10328,7 +10476,7 @@
                 <w:szCs w:val="28"/>
                 <w14:ligatures w14:val="none"/>
               </w:rPr>
-              <w:t>1m</w:t>
+              <w:t>1n</w:t>
             </w:r>
           </w:p>
         </w:tc>
@@ -10354,7 +10502,7 @@
                 <w:szCs w:val="28"/>
                 <w14:ligatures w14:val="none"/>
               </w:rPr>
-              <w:t xml:space="preserve">Setup Google Maps API Key </w:t>
+              <w:t>Setup initial database</w:t>
             </w:r>
           </w:p>
         </w:tc>
@@ -10432,7 +10580,7 @@
                 <w:szCs w:val="28"/>
                 <w14:ligatures w14:val="none"/>
               </w:rPr>
-              <w:t>Nate C</w:t>
+              <w:t>Kyler C</w:t>
             </w:r>
           </w:p>
         </w:tc>
@@ -10460,7 +10608,7 @@
                 <w:szCs w:val="28"/>
                 <w14:ligatures w14:val="none"/>
               </w:rPr>
-              <w:t>1n</w:t>
+              <w:t>1o</w:t>
             </w:r>
           </w:p>
         </w:tc>
@@ -10486,7 +10634,7 @@
                 <w:szCs w:val="28"/>
                 <w14:ligatures w14:val="none"/>
               </w:rPr>
-              <w:t>Setup initial database</w:t>
+              <w:t>Create initial mapping pins</w:t>
             </w:r>
           </w:p>
         </w:tc>
@@ -10564,7 +10712,7 @@
                 <w:szCs w:val="28"/>
                 <w14:ligatures w14:val="none"/>
               </w:rPr>
-              <w:t>Kyler C</w:t>
+              <w:t>Eric P</w:t>
             </w:r>
           </w:p>
         </w:tc>
@@ -10592,7 +10740,8 @@
                 <w:szCs w:val="28"/>
                 <w14:ligatures w14:val="none"/>
               </w:rPr>
-              <w:t>1o</w:t>
+              <w:lastRenderedPageBreak/>
+              <w:t>1p</w:t>
             </w:r>
           </w:p>
         </w:tc>
@@ -10618,7 +10767,7 @@
                 <w:szCs w:val="28"/>
                 <w14:ligatures w14:val="none"/>
               </w:rPr>
-              <w:t>Create initial mapping pins</w:t>
+              <w:t>Create dummy data for the first sprint</w:t>
             </w:r>
           </w:p>
         </w:tc>
@@ -10696,7 +10845,7 @@
                 <w:szCs w:val="28"/>
                 <w14:ligatures w14:val="none"/>
               </w:rPr>
-              <w:t>Eric P</w:t>
+              <w:t>Thomas R</w:t>
             </w:r>
           </w:p>
         </w:tc>
@@ -10724,139 +10873,6 @@
                 <w:szCs w:val="28"/>
                 <w14:ligatures w14:val="none"/>
               </w:rPr>
-              <w:t>1p</w:t>
-            </w:r>
-          </w:p>
-        </w:tc>
-        <w:tc>
-          <w:tcPr>
-            <w:tcW w:w="2033" w:type="dxa"/>
-            <w:hideMark/>
-          </w:tcPr>
-          <w:p>
-            <w:pPr>
-              <w:rPr>
-                <w:rFonts w:ascii="Times New Roman" w:eastAsia="Times New Roman" w:hAnsi="Times New Roman" w:cs="Times New Roman"/>
-                <w:kern w:val="0"/>
-                <w14:ligatures w14:val="none"/>
-              </w:rPr>
-            </w:pPr>
-            <w:r>
-              <w:rPr>
-                <w:rFonts w:ascii="Noto Serif CJK SC" w:eastAsia="Times New Roman" w:hAnsi="Noto Serif CJK SC" w:cs="Times New Roman"/>
-                <w:color w:val="000000"/>
-                <w:kern w:val="0"/>
-                <w:sz w:val="28"/>
-                <w:szCs w:val="28"/>
-                <w14:ligatures w14:val="none"/>
-              </w:rPr>
-              <w:t>Create dummy data for the first sprint</w:t>
-            </w:r>
-          </w:p>
-        </w:tc>
-        <w:tc>
-          <w:tcPr>
-            <w:tcW w:w="1764" w:type="dxa"/>
-            <w:hideMark/>
-          </w:tcPr>
-          <w:p>
-            <w:pPr>
-              <w:rPr>
-                <w:rFonts w:ascii="Times New Roman" w:eastAsia="Times New Roman" w:hAnsi="Times New Roman" w:cs="Times New Roman"/>
-                <w:kern w:val="0"/>
-                <w14:ligatures w14:val="none"/>
-              </w:rPr>
-            </w:pPr>
-            <w:r>
-              <w:rPr>
-                <w:rFonts w:ascii="Noto Serif CJK SC" w:eastAsia="Times New Roman" w:hAnsi="Noto Serif CJK SC" w:cs="Times New Roman"/>
-                <w:color w:val="000000"/>
-                <w:kern w:val="0"/>
-                <w:sz w:val="28"/>
-                <w:szCs w:val="28"/>
-                <w14:ligatures w14:val="none"/>
-              </w:rPr>
-              <w:t>Medium</w:t>
-            </w:r>
-          </w:p>
-        </w:tc>
-        <w:tc>
-          <w:tcPr>
-            <w:tcW w:w="2253" w:type="dxa"/>
-            <w:hideMark/>
-          </w:tcPr>
-          <w:p>
-            <w:pPr>
-              <w:rPr>
-                <w:rFonts w:ascii="Times New Roman" w:eastAsia="Times New Roman" w:hAnsi="Times New Roman" w:cs="Times New Roman"/>
-                <w:kern w:val="0"/>
-                <w14:ligatures w14:val="none"/>
-              </w:rPr>
-            </w:pPr>
-            <w:r>
-              <w:rPr>
-                <w:rFonts w:ascii="Noto Serif CJK SC" w:eastAsia="Times New Roman" w:hAnsi="Noto Serif CJK SC" w:cs="Times New Roman"/>
-                <w:color w:val="000000"/>
-                <w:kern w:val="0"/>
-                <w:sz w:val="28"/>
-                <w:szCs w:val="28"/>
-                <w14:ligatures w14:val="none"/>
-              </w:rPr>
-              <w:t>Complete</w:t>
-            </w:r>
-          </w:p>
-        </w:tc>
-        <w:tc>
-          <w:tcPr>
-            <w:tcW w:w="3510" w:type="dxa"/>
-            <w:hideMark/>
-          </w:tcPr>
-          <w:p>
-            <w:pPr>
-              <w:rPr>
-                <w:rFonts w:ascii="Times New Roman" w:eastAsia="Times New Roman" w:hAnsi="Times New Roman" w:cs="Times New Roman"/>
-                <w:kern w:val="0"/>
-                <w14:ligatures w14:val="none"/>
-              </w:rPr>
-            </w:pPr>
-            <w:r>
-              <w:rPr>
-                <w:rFonts w:ascii="Noto Serif CJK SC" w:eastAsia="Times New Roman" w:hAnsi="Noto Serif CJK SC" w:cs="Times New Roman"/>
-                <w:color w:val="000000"/>
-                <w:kern w:val="0"/>
-                <w:sz w:val="28"/>
-                <w:szCs w:val="28"/>
-                <w14:ligatures w14:val="none"/>
-              </w:rPr>
-              <w:t>Thomas R</w:t>
-            </w:r>
-          </w:p>
-        </w:tc>
-      </w:tr>
-      <w:tr>
-        <w:tc>
-          <w:tcPr>
-            <w:tcW w:w="605" w:type="dxa"/>
-            <w:hideMark/>
-          </w:tcPr>
-          <w:p>
-            <w:pPr>
-              <w:rPr>
-                <w:rFonts w:ascii="Times New Roman" w:eastAsia="Times New Roman" w:hAnsi="Times New Roman" w:cs="Times New Roman"/>
-                <w:kern w:val="0"/>
-                <w14:ligatures w14:val="none"/>
-              </w:rPr>
-            </w:pPr>
-            <w:r>
-              <w:rPr>
-                <w:rFonts w:ascii="Noto Serif CJK SC" w:eastAsia="Times New Roman" w:hAnsi="Noto Serif CJK SC" w:cs="Times New Roman"/>
-                <w:color w:val="000000"/>
-                <w:kern w:val="0"/>
-                <w:sz w:val="28"/>
-                <w:szCs w:val="28"/>
-                <w14:ligatures w14:val="none"/>
-              </w:rPr>
-              <w:lastRenderedPageBreak/>
               <w:t>1r</w:t>
             </w:r>
           </w:p>
@@ -12439,6 +12455,7 @@
                 <w:szCs w:val="28"/>
                 <w14:ligatures w14:val="none"/>
               </w:rPr>
+              <w:lastRenderedPageBreak/>
               <w:t>2i</w:t>
             </w:r>
           </w:p>
@@ -12571,7 +12588,6 @@
                 <w:szCs w:val="28"/>
                 <w14:ligatures w14:val="none"/>
               </w:rPr>
-              <w:lastRenderedPageBreak/>
               <w:t>2j</w:t>
             </w:r>
           </w:p>
@@ -15076,7 +15092,7 @@
   <w:abstractNum w:abstractNumId="14" w15:restartNumberingAfterBreak="0">
     <w:nsid w:val="408A1F29"/>
     <w:multiLevelType w:val="hybridMultilevel"/>
-    <w:tmpl w:val="1B948370"/>
+    <w:tmpl w:val="E488EAD8"/>
     <w:lvl w:ilvl="0" w:tplc="04090017">
       <w:start w:val="1"/>
       <w:numFmt w:val="lowerLetter"/>
@@ -15086,14 +15102,17 @@
         <w:ind w:left="1440" w:hanging="360"/>
       </w:pPr>
     </w:lvl>
-    <w:lvl w:ilvl="1" w:tplc="04090019" w:tentative="1">
-      <w:start w:val="1"/>
-      <w:numFmt w:val="lowerLetter"/>
-      <w:lvlText w:val="%2."/>
+    <w:lvl w:ilvl="1" w:tplc="04090001">
+      <w:start w:val="1"/>
+      <w:numFmt w:val="bullet"/>
+      <w:lvlText w:val=""/>
       <w:lvlJc w:val="left"/>
       <w:pPr>
         <w:ind w:left="2160" w:hanging="360"/>
       </w:pPr>
+      <w:rPr>
+        <w:rFonts w:ascii="Symbol" w:hAnsi="Symbol" w:hint="default"/>
+      </w:rPr>
     </w:lvl>
     <w:lvl w:ilvl="2" w:tplc="0409001B" w:tentative="1">
       <w:start w:val="1"/>
@@ -15160,6 +15179,119 @@
     </w:lvl>
   </w:abstractNum>
   <w:abstractNum w:abstractNumId="15" w15:restartNumberingAfterBreak="0">
+    <w:nsid w:val="46421AC7"/>
+    <w:multiLevelType w:val="hybridMultilevel"/>
+    <w:tmpl w:val="0A32643C"/>
+    <w:lvl w:ilvl="0" w:tplc="04090001">
+      <w:start w:val="1"/>
+      <w:numFmt w:val="bullet"/>
+      <w:lvlText w:val=""/>
+      <w:lvlJc w:val="left"/>
+      <w:pPr>
+        <w:ind w:left="720" w:hanging="360"/>
+      </w:pPr>
+      <w:rPr>
+        <w:rFonts w:ascii="Symbol" w:hAnsi="Symbol" w:hint="default"/>
+      </w:rPr>
+    </w:lvl>
+    <w:lvl w:ilvl="1" w:tplc="04090003" w:tentative="1">
+      <w:start w:val="1"/>
+      <w:numFmt w:val="bullet"/>
+      <w:lvlText w:val="o"/>
+      <w:lvlJc w:val="left"/>
+      <w:pPr>
+        <w:ind w:left="1440" w:hanging="360"/>
+      </w:pPr>
+      <w:rPr>
+        <w:rFonts w:ascii="Courier New" w:hAnsi="Courier New" w:cs="Courier New" w:hint="default"/>
+      </w:rPr>
+    </w:lvl>
+    <w:lvl w:ilvl="2" w:tplc="04090005" w:tentative="1">
+      <w:start w:val="1"/>
+      <w:numFmt w:val="bullet"/>
+      <w:lvlText w:val=""/>
+      <w:lvlJc w:val="left"/>
+      <w:pPr>
+        <w:ind w:left="2160" w:hanging="360"/>
+      </w:pPr>
+      <w:rPr>
+        <w:rFonts w:ascii="Wingdings" w:hAnsi="Wingdings" w:hint="default"/>
+      </w:rPr>
+    </w:lvl>
+    <w:lvl w:ilvl="3" w:tplc="04090001" w:tentative="1">
+      <w:start w:val="1"/>
+      <w:numFmt w:val="bullet"/>
+      <w:lvlText w:val=""/>
+      <w:lvlJc w:val="left"/>
+      <w:pPr>
+        <w:ind w:left="2880" w:hanging="360"/>
+      </w:pPr>
+      <w:rPr>
+        <w:rFonts w:ascii="Symbol" w:hAnsi="Symbol" w:hint="default"/>
+      </w:rPr>
+    </w:lvl>
+    <w:lvl w:ilvl="4" w:tplc="04090003" w:tentative="1">
+      <w:start w:val="1"/>
+      <w:numFmt w:val="bullet"/>
+      <w:lvlText w:val="o"/>
+      <w:lvlJc w:val="left"/>
+      <w:pPr>
+        <w:ind w:left="3600" w:hanging="360"/>
+      </w:pPr>
+      <w:rPr>
+        <w:rFonts w:ascii="Courier New" w:hAnsi="Courier New" w:cs="Courier New" w:hint="default"/>
+      </w:rPr>
+    </w:lvl>
+    <w:lvl w:ilvl="5" w:tplc="04090005" w:tentative="1">
+      <w:start w:val="1"/>
+      <w:numFmt w:val="bullet"/>
+      <w:lvlText w:val=""/>
+      <w:lvlJc w:val="left"/>
+      <w:pPr>
+        <w:ind w:left="4320" w:hanging="360"/>
+      </w:pPr>
+      <w:rPr>
+        <w:rFonts w:ascii="Wingdings" w:hAnsi="Wingdings" w:hint="default"/>
+      </w:rPr>
+    </w:lvl>
+    <w:lvl w:ilvl="6" w:tplc="04090001" w:tentative="1">
+      <w:start w:val="1"/>
+      <w:numFmt w:val="bullet"/>
+      <w:lvlText w:val=""/>
+      <w:lvlJc w:val="left"/>
+      <w:pPr>
+        <w:ind w:left="5040" w:hanging="360"/>
+      </w:pPr>
+      <w:rPr>
+        <w:rFonts w:ascii="Symbol" w:hAnsi="Symbol" w:hint="default"/>
+      </w:rPr>
+    </w:lvl>
+    <w:lvl w:ilvl="7" w:tplc="04090003" w:tentative="1">
+      <w:start w:val="1"/>
+      <w:numFmt w:val="bullet"/>
+      <w:lvlText w:val="o"/>
+      <w:lvlJc w:val="left"/>
+      <w:pPr>
+        <w:ind w:left="5760" w:hanging="360"/>
+      </w:pPr>
+      <w:rPr>
+        <w:rFonts w:ascii="Courier New" w:hAnsi="Courier New" w:cs="Courier New" w:hint="default"/>
+      </w:rPr>
+    </w:lvl>
+    <w:lvl w:ilvl="8" w:tplc="04090005" w:tentative="1">
+      <w:start w:val="1"/>
+      <w:numFmt w:val="bullet"/>
+      <w:lvlText w:val=""/>
+      <w:lvlJc w:val="left"/>
+      <w:pPr>
+        <w:ind w:left="6480" w:hanging="360"/>
+      </w:pPr>
+      <w:rPr>
+        <w:rFonts w:ascii="Wingdings" w:hAnsi="Wingdings" w:hint="default"/>
+      </w:rPr>
+    </w:lvl>
+  </w:abstractNum>
+  <w:abstractNum w:abstractNumId="16" w15:restartNumberingAfterBreak="0">
     <w:nsid w:val="4E740F72"/>
     <w:multiLevelType w:val="multilevel"/>
     <w:tmpl w:val="85905CB4"/>
@@ -15308,7 +15440,120 @@
       </w:rPr>
     </w:lvl>
   </w:abstractNum>
-  <w:abstractNum w:abstractNumId="16" w15:restartNumberingAfterBreak="0">
+  <w:abstractNum w:abstractNumId="17" w15:restartNumberingAfterBreak="0">
+    <w:nsid w:val="55364C1E"/>
+    <w:multiLevelType w:val="hybridMultilevel"/>
+    <w:tmpl w:val="C53ABAEA"/>
+    <w:lvl w:ilvl="0" w:tplc="04090001">
+      <w:start w:val="1"/>
+      <w:numFmt w:val="bullet"/>
+      <w:lvlText w:val=""/>
+      <w:lvlJc w:val="left"/>
+      <w:pPr>
+        <w:ind w:left="720" w:hanging="360"/>
+      </w:pPr>
+      <w:rPr>
+        <w:rFonts w:ascii="Symbol" w:hAnsi="Symbol" w:hint="default"/>
+      </w:rPr>
+    </w:lvl>
+    <w:lvl w:ilvl="1" w:tplc="04090003" w:tentative="1">
+      <w:start w:val="1"/>
+      <w:numFmt w:val="bullet"/>
+      <w:lvlText w:val="o"/>
+      <w:lvlJc w:val="left"/>
+      <w:pPr>
+        <w:ind w:left="1440" w:hanging="360"/>
+      </w:pPr>
+      <w:rPr>
+        <w:rFonts w:ascii="Courier New" w:hAnsi="Courier New" w:cs="Courier New" w:hint="default"/>
+      </w:rPr>
+    </w:lvl>
+    <w:lvl w:ilvl="2" w:tplc="04090005" w:tentative="1">
+      <w:start w:val="1"/>
+      <w:numFmt w:val="bullet"/>
+      <w:lvlText w:val=""/>
+      <w:lvlJc w:val="left"/>
+      <w:pPr>
+        <w:ind w:left="2160" w:hanging="360"/>
+      </w:pPr>
+      <w:rPr>
+        <w:rFonts w:ascii="Wingdings" w:hAnsi="Wingdings" w:hint="default"/>
+      </w:rPr>
+    </w:lvl>
+    <w:lvl w:ilvl="3" w:tplc="04090001" w:tentative="1">
+      <w:start w:val="1"/>
+      <w:numFmt w:val="bullet"/>
+      <w:lvlText w:val=""/>
+      <w:lvlJc w:val="left"/>
+      <w:pPr>
+        <w:ind w:left="2880" w:hanging="360"/>
+      </w:pPr>
+      <w:rPr>
+        <w:rFonts w:ascii="Symbol" w:hAnsi="Symbol" w:hint="default"/>
+      </w:rPr>
+    </w:lvl>
+    <w:lvl w:ilvl="4" w:tplc="04090003" w:tentative="1">
+      <w:start w:val="1"/>
+      <w:numFmt w:val="bullet"/>
+      <w:lvlText w:val="o"/>
+      <w:lvlJc w:val="left"/>
+      <w:pPr>
+        <w:ind w:left="3600" w:hanging="360"/>
+      </w:pPr>
+      <w:rPr>
+        <w:rFonts w:ascii="Courier New" w:hAnsi="Courier New" w:cs="Courier New" w:hint="default"/>
+      </w:rPr>
+    </w:lvl>
+    <w:lvl w:ilvl="5" w:tplc="04090005" w:tentative="1">
+      <w:start w:val="1"/>
+      <w:numFmt w:val="bullet"/>
+      <w:lvlText w:val=""/>
+      <w:lvlJc w:val="left"/>
+      <w:pPr>
+        <w:ind w:left="4320" w:hanging="360"/>
+      </w:pPr>
+      <w:rPr>
+        <w:rFonts w:ascii="Wingdings" w:hAnsi="Wingdings" w:hint="default"/>
+      </w:rPr>
+    </w:lvl>
+    <w:lvl w:ilvl="6" w:tplc="04090001" w:tentative="1">
+      <w:start w:val="1"/>
+      <w:numFmt w:val="bullet"/>
+      <w:lvlText w:val=""/>
+      <w:lvlJc w:val="left"/>
+      <w:pPr>
+        <w:ind w:left="5040" w:hanging="360"/>
+      </w:pPr>
+      <w:rPr>
+        <w:rFonts w:ascii="Symbol" w:hAnsi="Symbol" w:hint="default"/>
+      </w:rPr>
+    </w:lvl>
+    <w:lvl w:ilvl="7" w:tplc="04090003" w:tentative="1">
+      <w:start w:val="1"/>
+      <w:numFmt w:val="bullet"/>
+      <w:lvlText w:val="o"/>
+      <w:lvlJc w:val="left"/>
+      <w:pPr>
+        <w:ind w:left="5760" w:hanging="360"/>
+      </w:pPr>
+      <w:rPr>
+        <w:rFonts w:ascii="Courier New" w:hAnsi="Courier New" w:cs="Courier New" w:hint="default"/>
+      </w:rPr>
+    </w:lvl>
+    <w:lvl w:ilvl="8" w:tplc="04090005" w:tentative="1">
+      <w:start w:val="1"/>
+      <w:numFmt w:val="bullet"/>
+      <w:lvlText w:val=""/>
+      <w:lvlJc w:val="left"/>
+      <w:pPr>
+        <w:ind w:left="6480" w:hanging="360"/>
+      </w:pPr>
+      <w:rPr>
+        <w:rFonts w:ascii="Wingdings" w:hAnsi="Wingdings" w:hint="default"/>
+      </w:rPr>
+    </w:lvl>
+  </w:abstractNum>
+  <w:abstractNum w:abstractNumId="18" w15:restartNumberingAfterBreak="0">
     <w:nsid w:val="5B4C3DAC"/>
     <w:multiLevelType w:val="multilevel"/>
     <w:tmpl w:val="4FD4F792"/>
@@ -15457,7 +15702,7 @@
       </w:rPr>
     </w:lvl>
   </w:abstractNum>
-  <w:abstractNum w:abstractNumId="17" w15:restartNumberingAfterBreak="0">
+  <w:abstractNum w:abstractNumId="19" w15:restartNumberingAfterBreak="0">
     <w:nsid w:val="68C230CC"/>
     <w:multiLevelType w:val="hybridMultilevel"/>
     <w:tmpl w:val="5BD679E6"/>
@@ -15543,7 +15788,7 @@
       </w:pPr>
     </w:lvl>
   </w:abstractNum>
-  <w:abstractNum w:abstractNumId="18" w15:restartNumberingAfterBreak="0">
+  <w:abstractNum w:abstractNumId="20" w15:restartNumberingAfterBreak="0">
     <w:nsid w:val="703335DF"/>
     <w:multiLevelType w:val="multilevel"/>
     <w:tmpl w:val="DFA448E0"/>
@@ -15692,7 +15937,7 @@
       </w:rPr>
     </w:lvl>
   </w:abstractNum>
-  <w:abstractNum w:abstractNumId="19" w15:restartNumberingAfterBreak="0">
+  <w:abstractNum w:abstractNumId="21" w15:restartNumberingAfterBreak="0">
     <w:nsid w:val="788E2611"/>
     <w:multiLevelType w:val="multilevel"/>
     <w:tmpl w:val="38F0A0AC"/>
@@ -15869,16 +16114,16 @@
     <w:abstractNumId w:val="2"/>
   </w:num>
   <w:num w:numId="10" w16cid:durableId="656762087">
-    <w:abstractNumId w:val="19"/>
+    <w:abstractNumId w:val="21"/>
   </w:num>
   <w:num w:numId="11" w16cid:durableId="2005548125">
-    <w:abstractNumId w:val="15"/>
+    <w:abstractNumId w:val="16"/>
   </w:num>
   <w:num w:numId="12" w16cid:durableId="365836083">
-    <w:abstractNumId w:val="18"/>
+    <w:abstractNumId w:val="20"/>
   </w:num>
   <w:num w:numId="13" w16cid:durableId="741290461">
-    <w:abstractNumId w:val="16"/>
+    <w:abstractNumId w:val="18"/>
   </w:num>
   <w:num w:numId="14" w16cid:durableId="60181353">
     <w:abstractNumId w:val="9"/>
@@ -15896,10 +16141,16 @@
     <w:abstractNumId w:val="14"/>
   </w:num>
   <w:num w:numId="19" w16cid:durableId="1692875258">
-    <w:abstractNumId w:val="17"/>
+    <w:abstractNumId w:val="19"/>
   </w:num>
   <w:num w:numId="20" w16cid:durableId="1321038642">
     <w:abstractNumId w:val="5"/>
+  </w:num>
+  <w:num w:numId="21" w16cid:durableId="2035105594">
+    <w:abstractNumId w:val="15"/>
+  </w:num>
+  <w:num w:numId="22" w16cid:durableId="1850019919">
+    <w:abstractNumId w:val="17"/>
   </w:num>
 </w:numbering>
 </file>
@@ -16515,6 +16766,7 @@
   <w:style w:type="character" w:default="1" w:styleId="DefaultParagraphFont">
     <w:name w:val="Default Paragraph Font"/>
     <w:uiPriority w:val="1"/>
+    <w:semiHidden/>
     <w:unhideWhenUsed/>
   </w:style>
   <w:style w:type="table" w:default="1" w:styleId="TableNormal">

</xml_diff>